<commit_message>
Restructure budget to match LINGUA Africa Submittable form categories
Split coordinateurs from Personnel into a separate 'Data Collection &
Processing' line (14 × 100 × 8 = 11,200 USD), rename 'Équipement et
matériel' → 'Équipement et logiciels', renumber sections 3–7 → 4–8.
Personnel drops from 178,500 to 167,300 USD; total directs unchanged
at 209,500 USD; grand total cash unchanged at 220,000 USD.

Updated in: LINGUA_Africa_Application_QA.md, generate_application.py,
generate_application_en.py, generate_budget.py, and all three generated
artefacts (DOCX × 2, XLSX × 1).
</commit_message>
<xml_diff>
--- a/LINGUA_Africa_Application_MGVaovao_EN.docx
+++ b/LINGUA_Africa_Application_MGVaovao_EN.docx
@@ -1572,7 +1572,7 @@
                 <w:rFonts w:ascii="Calibri" w:hAnsi="Calibri"/>
                 <w:sz w:val="20"/>
               </w:rPr>
-              <w:t>178,500</w:t>
+              <w:t>167,300</w:t>
             </w:r>
           </w:p>
         </w:tc>
@@ -1588,7 +1588,7 @@
                 <w:rFonts w:ascii="Calibri" w:hAnsi="Calibri"/>
                 <w:sz w:val="20"/>
               </w:rPr>
-              <w:t>2. Equipment and materials</w:t>
+              <w:t>2. Equipment and software</w:t>
             </w:r>
           </w:p>
         </w:tc>
@@ -1618,7 +1618,37 @@
                 <w:rFonts w:ascii="Calibri" w:hAnsi="Calibri"/>
                 <w:sz w:val="20"/>
               </w:rPr>
-              <w:t>3. Travel and field activities</w:t>
+              <w:t>3. Data collection and processing</w:t>
+            </w:r>
+          </w:p>
+        </w:tc>
+        <w:tc>
+          <w:tcPr>
+            <w:tcW w:type="dxa" w:w="4533"/>
+          </w:tcPr>
+          <w:p>
+            <w:r>
+              <w:rPr>
+                <w:rFonts w:ascii="Calibri" w:hAnsi="Calibri"/>
+                <w:sz w:val="20"/>
+              </w:rPr>
+              <w:t>11,200</w:t>
+            </w:r>
+          </w:p>
+        </w:tc>
+      </w:tr>
+      <w:tr>
+        <w:tc>
+          <w:tcPr>
+            <w:tcW w:type="dxa" w:w="4533"/>
+          </w:tcPr>
+          <w:p>
+            <w:r>
+              <w:rPr>
+                <w:rFonts w:ascii="Calibri" w:hAnsi="Calibri"/>
+                <w:sz w:val="20"/>
+              </w:rPr>
+              <w:t>4. Travel and field activities</w:t>
             </w:r>
           </w:p>
         </w:tc>
@@ -1648,7 +1678,7 @@
                 <w:rFonts w:ascii="Calibri" w:hAnsi="Calibri"/>
                 <w:sz w:val="20"/>
               </w:rPr>
-              <w:t>4. Training and workshops</w:t>
+              <w:t>5. Workshops, meetings and training</w:t>
             </w:r>
           </w:p>
         </w:tc>
@@ -1678,7 +1708,7 @@
                 <w:rFonts w:ascii="Calibri" w:hAnsi="Calibri"/>
                 <w:sz w:val="20"/>
               </w:rPr>
-              <w:t>5. Communication and documentation</w:t>
+              <w:t>6. Communications and outreach</w:t>
             </w:r>
           </w:p>
         </w:tc>
@@ -1708,7 +1738,7 @@
                 <w:rFonts w:ascii="Calibri" w:hAnsi="Calibri"/>
                 <w:sz w:val="20"/>
               </w:rPr>
-              <w:t>6. Other direct costs</w:t>
+              <w:t>7. Other direct costs</w:t>
             </w:r>
           </w:p>
         </w:tc>
@@ -1770,7 +1800,7 @@
                 <w:rFonts w:ascii="Calibri" w:hAnsi="Calibri"/>
                 <w:sz w:val="20"/>
               </w:rPr>
-              <w:t>7. Overhead / Indirect Costs (5%)</w:t>
+              <w:t>8. Overhead / Indirect Costs (5%)</w:t>
             </w:r>
           </w:p>
         </w:tc>
@@ -1853,16 +1883,19 @@
         <w:t>The proposed budget of USD 220,000 faithfully reflects the planned activities and the real cost structure of the Malagasy context, remaining well below the USD 250,000 ceiling for Category 3.</w:t>
         <w:br/>
         <w:br/>
-        <w:t>Personnel (USD 178,500) covers the full team over eighteen months: the founder in strategic advisory at 50% (1,250 × 18 = 22,500); the local director full-time (2,000 × 18 = 36,000); the Technical ML Project Lead (1,800 × 18 = 32,400); the Data Operations Project Lead (1,800 × 18 = 32,400); a third project lead starting month 7 (1,800 × 12 = 21,600); two junior AI developers (14,400 + 8,000); and fourteen local field coordinators at USD 100 per person per month over 8 active months (14 × 100 × 8 = 11,200). Rates are fair relative to local standards while reflecting the level of expertise required.</w:t>
+        <w:t>Personnel (USD 167,300) covers the core permanent team over eighteen months: the founder in strategic advisory at 50% (1,250 × 18 = 22,500); the local director full-time (2,000 × 18 = 36,000); the Technical ML Project Lead (1,800 × 18 = 32,400); the Data Operations Project Lead (1,800 × 18 = 32,400); a third project lead starting month 7 (1,800 × 12 = 21,600); and two junior AI developers (14,400 + 8,000).</w:t>
         <w:br/>
         <w:br/>
-        <w:t>Equipment (USD 8,000) covers six laptops for the local technical team, fourteen field tablets at USD 150 each, fourteen collection microphones at USD 50 each, and connectivity hardware.</w:t>
+        <w:t>Data collection and processing (USD 11,200) covers fourteen local field coordinators recruited from within the speaker communities, at USD 100 per person per month over 8 active collection months (14 × 100 × 8 = 11,200). Rates are fair relative to local standards.</w:t>
+        <w:br/>
+        <w:br/>
+        <w:t>Equipment and software (USD 8,000) covers six laptops for the technical team, fourteen field tablets at USD 150 each, fourteen collection microphones at USD 50 each, and connectivity hardware.</w:t>
         <w:br/>
         <w:br/>
         <w:t>Travel and field activities (USD 16,000) cover missions to fourteen geographically dispersed regions across the island, per diem, accommodation, and room rental.</w:t>
         <w:br/>
         <w:br/>
-        <w:t>Workshops and training (USD 4,500) fund local coordinator training, a final dissemination workshop, and participation in a regional conference. Overhead is capped at 5% (USD 10,500), reflecting the organisation's lean structure. Frugality is a design principle throughout: the monthly operational cost in production steady-state is approximately USD 42, ensuring service sustainability long after the funded period.</w:t>
+        <w:t>Workshops and training (USD 4,500) fund local coordinator training, a final dissemination workshop, and participation in a regional conference. Overhead is capped at 5% (USD 10,500), reflecting the organisation's lean structure. Frugality is a design principle: the monthly operational cost in production is approximately USD 42, ensuring service sustainability long after the funded period.</w:t>
       </w:r>
     </w:p>
     <w:p>

</xml_diff>

<commit_message>
Expand data team to 54 collectors + 36 annotators; devs as co-financing
- Separate collection (section 3) and annotation/ground truth (section 4)
  as distinct budget lines
- 54 field collectors (3/dialect × 18 dialects) at 600 000 MGA (133 USD)
  × 4 active months = 28 728 USD
- 36 annotators (2/dialect × 18 dialects) at 900 000 MGA (200 USD)
  × 4 active months = 28 800 USD
- Remove 2 junior AI devs from LINGUA Africa budget; all 8 developers
  (backend, frontend, IA, data science, DevOps) appear as organisation
  co-financing at 1 500 000 MGA/month × 18 months = 47 952 USD
- Personnel drops to 144 900 USD (core leadership only)
- New totals: directs 233 428 | overhead 11 671 | cash total 245 099 USD
  (still under the 250 000 USD Category 3 cap)
- Updated across: QA.md, generate_application.py, generate_application_en.py,
  generate_budget.py and all three generated artefacts
</commit_message>
<xml_diff>
--- a/LINGUA_Africa_Application_MGVaovao_EN.docx
+++ b/LINGUA_Africa_Application_MGVaovao_EN.docx
@@ -1558,7 +1558,7 @@
                 <w:rFonts w:ascii="Calibri" w:hAnsi="Calibri"/>
                 <w:sz w:val="20"/>
               </w:rPr>
-              <w:t>1. Personnel</w:t>
+              <w:t>1. Personnel — permanent leadership (5 positions)</w:t>
             </w:r>
           </w:p>
         </w:tc>
@@ -1572,7 +1572,7 @@
                 <w:rFonts w:ascii="Calibri" w:hAnsi="Calibri"/>
                 <w:sz w:val="20"/>
               </w:rPr>
-              <w:t>167,300</w:t>
+              <w:t>144,900</w:t>
             </w:r>
           </w:p>
         </w:tc>
@@ -1618,7 +1618,7 @@
                 <w:rFonts w:ascii="Calibri" w:hAnsi="Calibri"/>
                 <w:sz w:val="20"/>
               </w:rPr>
-              <w:t>3. Data collection and processing</w:t>
+              <w:t>3. Field collection — 54 collectors × USD 133 × 4 months</w:t>
             </w:r>
           </w:p>
         </w:tc>
@@ -1632,7 +1632,7 @@
                 <w:rFonts w:ascii="Calibri" w:hAnsi="Calibri"/>
                 <w:sz w:val="20"/>
               </w:rPr>
-              <w:t>11,200</w:t>
+              <w:t>28,728</w:t>
             </w:r>
           </w:p>
         </w:tc>
@@ -1648,7 +1648,37 @@
                 <w:rFonts w:ascii="Calibri" w:hAnsi="Calibri"/>
                 <w:sz w:val="20"/>
               </w:rPr>
-              <w:t>4. Travel and field activities</w:t>
+              <w:t>4. Annotation &amp; ground truth — 36 annotators × USD 200 × 4 months</w:t>
+            </w:r>
+          </w:p>
+        </w:tc>
+        <w:tc>
+          <w:tcPr>
+            <w:tcW w:type="dxa" w:w="4533"/>
+          </w:tcPr>
+          <w:p>
+            <w:r>
+              <w:rPr>
+                <w:rFonts w:ascii="Calibri" w:hAnsi="Calibri"/>
+                <w:sz w:val="20"/>
+              </w:rPr>
+              <w:t>28,800</w:t>
+            </w:r>
+          </w:p>
+        </w:tc>
+      </w:tr>
+      <w:tr>
+        <w:tc>
+          <w:tcPr>
+            <w:tcW w:type="dxa" w:w="4533"/>
+          </w:tcPr>
+          <w:p>
+            <w:r>
+              <w:rPr>
+                <w:rFonts w:ascii="Calibri" w:hAnsi="Calibri"/>
+                <w:sz w:val="20"/>
+              </w:rPr>
+              <w:t>5. Travel and field activities</w:t>
             </w:r>
           </w:p>
         </w:tc>
@@ -1678,7 +1708,7 @@
                 <w:rFonts w:ascii="Calibri" w:hAnsi="Calibri"/>
                 <w:sz w:val="20"/>
               </w:rPr>
-              <w:t>5. Workshops, meetings and training</w:t>
+              <w:t>6. Workshops, meetings and training</w:t>
             </w:r>
           </w:p>
         </w:tc>
@@ -1708,7 +1738,7 @@
                 <w:rFonts w:ascii="Calibri" w:hAnsi="Calibri"/>
                 <w:sz w:val="20"/>
               </w:rPr>
-              <w:t>6. Communications and outreach</w:t>
+              <w:t>7. Communications and outreach</w:t>
             </w:r>
           </w:p>
         </w:tc>
@@ -1738,7 +1768,7 @@
                 <w:rFonts w:ascii="Calibri" w:hAnsi="Calibri"/>
                 <w:sz w:val="20"/>
               </w:rPr>
-              <w:t>7. Other direct costs</w:t>
+              <w:t>8. Other direct costs</w:t>
             </w:r>
           </w:p>
         </w:tc>
@@ -1784,7 +1814,7 @@
                 <w:b/>
                 <w:sz w:val="20"/>
               </w:rPr>
-              <w:t>209,500</w:t>
+              <w:t>233,428</w:t>
             </w:r>
           </w:p>
         </w:tc>
@@ -1800,7 +1830,7 @@
                 <w:rFonts w:ascii="Calibri" w:hAnsi="Calibri"/>
                 <w:sz w:val="20"/>
               </w:rPr>
-              <w:t>8. Overhead / Indirect Costs (5%)</w:t>
+              <w:t>9. Overhead / Indirect Costs (5%)</w:t>
             </w:r>
           </w:p>
         </w:tc>
@@ -1814,7 +1844,7 @@
                 <w:rFonts w:ascii="Calibri" w:hAnsi="Calibri"/>
                 <w:sz w:val="20"/>
               </w:rPr>
-              <w:t>10,500</w:t>
+              <w:t>11,671</w:t>
             </w:r>
           </w:p>
         </w:tc>
@@ -1846,12 +1876,27 @@
                 <w:b/>
                 <w:sz w:val="20"/>
               </w:rPr>
-              <w:t>220,000</w:t>
+              <w:t>245,099</w:t>
             </w:r>
           </w:p>
         </w:tc>
       </w:tr>
     </w:tbl>
+    <w:p>
+      <w:pPr>
+        <w:spacing w:before="20" w:after="120"/>
+        <w:ind w:left="283"/>
+      </w:pPr>
+      <w:r>
+        <w:rPr>
+          <w:rFonts w:ascii="Calibri" w:hAnsi="Calibri"/>
+          <w:b w:val="0"/>
+          <w:i w:val="0"/>
+          <w:sz w:val="22"/>
+        </w:rPr>
+        <w:t>Organisation co-financing (outside LINGUA Africa budget): 8 developers (backend, frontend, AI, data science, DevOps) × USD 333 (1,500,000 MGA) × 18 months = USD 47,952.</w:t>
+      </w:r>
+    </w:p>
     <w:p/>
     <w:p>
       <w:pPr>
@@ -1880,22 +1925,19 @@
           <w:i w:val="0"/>
           <w:sz w:val="22"/>
         </w:rPr>
-        <w:t>The proposed budget of USD 220,000 faithfully reflects the planned activities and the real cost structure of the Malagasy context, remaining well below the USD 250,000 ceiling for Category 3.</w:t>
+        <w:t>The proposed budget of USD 245,099 faithfully reflects the planned activities and the real cost structure of the Malagasy context, remaining below the USD 250,000 ceiling for Category 3.</w:t>
         <w:br/>
         <w:br/>
-        <w:t>Personnel (USD 167,300) covers the core permanent team over eighteen months: the founder in strategic advisory at 50% (1,250 × 18 = 22,500); the local director full-time (2,000 × 18 = 36,000); the Technical ML Project Lead (1,800 × 18 = 32,400); the Data Operations Project Lead (1,800 × 18 = 32,400); a third project lead starting month 7 (1,800 × 12 = 21,600); and two junior AI developers (14,400 + 8,000).</w:t>
+        <w:t>Personnel (USD 144,900) covers the permanent leadership team over eighteen months: the founder in strategic advisory at 50% (22,500); the local director full-time (36,000); the Technical ML Project Lead (32,400); the Data Operations Project Lead (32,400); and a partnerships project lead starting month 7 (21,600). The technical team of eight developers — backend, frontend, AI, data science, DevOps — constitutes an organisation co-financing contribution of USD 47,952 (1,500,000 MGA per developer per month × 18 months), not included in the LINGUA Africa request.</w:t>
         <w:br/>
         <w:br/>
-        <w:t>Data collection and processing (USD 11,200) covers fourteen local field coordinators recruited from within the speaker communities, at USD 100 per person per month over 8 active collection months (14 × 100 × 8 = 11,200). Rates are fair relative to local standards.</w:t>
+        <w:t>Field collection (USD 28,728) pays 54 field collectors — three per dialect across eighteen dialects — at USD 133/month (600,000 MGA) over four active collection months.</w:t>
         <w:br/>
         <w:br/>
-        <w:t>Equipment and software (USD 8,000) covers six laptops for the technical team, fourteen field tablets at USD 150 each, fourteen collection microphones at USD 50 each, and connectivity hardware.</w:t>
+        <w:t>Annotation and ground truth (USD 28,800) pays 36 transcription annotators — two per dialect — at USD 200/month (900,000 MGA) over four active processing months.</w:t>
         <w:br/>
         <w:br/>
-        <w:t>Travel and field activities (USD 16,000) cover missions to fourteen geographically dispersed regions across the island, per diem, accommodation, and room rental.</w:t>
-        <w:br/>
-        <w:br/>
-        <w:t>Workshops and training (USD 4,500) fund local coordinator training, a final dissemination workshop, and participation in a regional conference. Overhead is capped at 5% (USD 10,500), reflecting the organisation's lean structure. Frugality is a design principle: the monthly operational cost in production is approximately USD 42, ensuring service sustainability long after the funded period.</w:t>
+        <w:t>Equipment and software (USD 8,000) covers six laptops and field recording hardware. Travel (USD 16,000) covers eighteen dialect regions. Workshops (USD 4,500) fund field team training, a final dissemination event, and a regional conference. Overhead is capped at 5% (USD 11,671).</w:t>
       </w:r>
     </w:p>
     <w:p>

</xml_diff>

<commit_message>
Budget: integrate 8 devs fully, reduce data workers to stay within 250K cap
All 8 developers (1 500 000 MGA/month = 333 USD) are now inside the LINGUA
Africa budget. Personnel rises to 192 852 USD (13 posts). Data collection is
reduced to 20 collectors × 133 USD × 4 months (10 640 USD) and 9 annotators
× 133 USD × 3 months (3 591 USD) to respect the cap.

Grand total: 238 083 direct + 11 904 overhead = 249 987 USD (< 250 000 ✓).

Updated: generate_budget.py, generate_application.py, generate_application_en.py,
LINGUA_Africa_Application_QA.md and all three generated artefacts.
</commit_message>
<xml_diff>
--- a/LINGUA_Africa_Application_MGVaovao_EN.docx
+++ b/LINGUA_Africa_Application_MGVaovao_EN.docx
@@ -1558,7 +1558,7 @@
                 <w:rFonts w:ascii="Calibri" w:hAnsi="Calibri"/>
                 <w:sz w:val="20"/>
               </w:rPr>
-              <w:t>1. Personnel — permanent leadership (5 positions)</w:t>
+              <w:t>1. Personnel — leadership + technical team (13 positions)</w:t>
             </w:r>
           </w:p>
         </w:tc>
@@ -1572,7 +1572,7 @@
                 <w:rFonts w:ascii="Calibri" w:hAnsi="Calibri"/>
                 <w:sz w:val="20"/>
               </w:rPr>
-              <w:t>144,900</w:t>
+              <w:t>192,852</w:t>
             </w:r>
           </w:p>
         </w:tc>
@@ -1618,7 +1618,7 @@
                 <w:rFonts w:ascii="Calibri" w:hAnsi="Calibri"/>
                 <w:sz w:val="20"/>
               </w:rPr>
-              <w:t>3. Field collection — 54 collectors × USD 133 × 4 months</w:t>
+              <w:t>3. Field collection — 20 collectors × USD 133 × 4 months</w:t>
             </w:r>
           </w:p>
         </w:tc>
@@ -1632,7 +1632,7 @@
                 <w:rFonts w:ascii="Calibri" w:hAnsi="Calibri"/>
                 <w:sz w:val="20"/>
               </w:rPr>
-              <w:t>28,728</w:t>
+              <w:t>10,640</w:t>
             </w:r>
           </w:p>
         </w:tc>
@@ -1648,7 +1648,7 @@
                 <w:rFonts w:ascii="Calibri" w:hAnsi="Calibri"/>
                 <w:sz w:val="20"/>
               </w:rPr>
-              <w:t>4. Annotation &amp; ground truth — 36 annotators × USD 200 × 4 months</w:t>
+              <w:t>4. Annotation &amp; ground truth — 9 annotators × USD 133 × 3 months</w:t>
             </w:r>
           </w:p>
         </w:tc>
@@ -1662,7 +1662,7 @@
                 <w:rFonts w:ascii="Calibri" w:hAnsi="Calibri"/>
                 <w:sz w:val="20"/>
               </w:rPr>
-              <w:t>28,800</w:t>
+              <w:t>3,591</w:t>
             </w:r>
           </w:p>
         </w:tc>
@@ -1814,7 +1814,7 @@
                 <w:b/>
                 <w:sz w:val="20"/>
               </w:rPr>
-              <w:t>233,428</w:t>
+              <w:t>238,083</w:t>
             </w:r>
           </w:p>
         </w:tc>
@@ -1844,7 +1844,7 @@
                 <w:rFonts w:ascii="Calibri" w:hAnsi="Calibri"/>
                 <w:sz w:val="20"/>
               </w:rPr>
-              <w:t>11,671</w:t>
+              <w:t>11,904</w:t>
             </w:r>
           </w:p>
         </w:tc>
@@ -1876,27 +1876,12 @@
                 <w:b/>
                 <w:sz w:val="20"/>
               </w:rPr>
-              <w:t>245,099</w:t>
+              <w:t>249,987</w:t>
             </w:r>
           </w:p>
         </w:tc>
       </w:tr>
     </w:tbl>
-    <w:p>
-      <w:pPr>
-        <w:spacing w:before="20" w:after="120"/>
-        <w:ind w:left="283"/>
-      </w:pPr>
-      <w:r>
-        <w:rPr>
-          <w:rFonts w:ascii="Calibri" w:hAnsi="Calibri"/>
-          <w:b w:val="0"/>
-          <w:i w:val="0"/>
-          <w:sz w:val="22"/>
-        </w:rPr>
-        <w:t>Organisation co-financing (outside LINGUA Africa budget): 8 developers (backend, frontend, AI, data science, DevOps) × USD 333 (1,500,000 MGA) × 18 months = USD 47,952.</w:t>
-      </w:r>
-    </w:p>
     <w:p/>
     <w:p>
       <w:pPr>
@@ -1925,19 +1910,19 @@
           <w:i w:val="0"/>
           <w:sz w:val="22"/>
         </w:rPr>
-        <w:t>The proposed budget of USD 245,099 faithfully reflects the planned activities and the real cost structure of the Malagasy context, remaining below the USD 250,000 ceiling for Category 3.</w:t>
+        <w:t>The proposed budget of USD 249,987 faithfully reflects the planned activities and the real cost structure of the Malagasy context, remaining below the USD 250,000 ceiling for Category 3.</w:t>
         <w:br/>
         <w:br/>
-        <w:t>Personnel (USD 144,900) covers the permanent leadership team over eighteen months: the founder in strategic advisory at 50% (22,500); the local director full-time (36,000); the Technical ML Project Lead (32,400); the Data Operations Project Lead (32,400); and a partnerships project lead starting month 7 (21,600). The technical team of eight developers — backend, frontend, AI, data science, DevOps — constitutes an organisation co-financing contribution of USD 47,952 (1,500,000 MGA per developer per month × 18 months), not included in the LINGUA Africa request.</w:t>
+        <w:t>Personnel (USD 192,852) covers 13 positions over eighteen months: the five permanent leadership team members (founder at 50%, local director, Technical ML Project Lead, Data Operations Project Lead, and partnerships project lead starting month 7), plus eight developers — backend, frontend, AI, data science, DevOps — paid at 1,500,000 MGA per month (USD 333 each), fully included in the LINGUA Africa budget.</w:t>
         <w:br/>
         <w:br/>
-        <w:t>Field collection (USD 28,728) pays 54 field collectors — three per dialect across eighteen dialects — at USD 133/month (600,000 MGA) over four active collection months.</w:t>
+        <w:t>Field collection (USD 10,640) pays 20 field collectors at USD 133/month (600,000 MGA) over four active collection months (20 × 133 × 4 = USD 10,640).</w:t>
         <w:br/>
         <w:br/>
-        <w:t>Annotation and ground truth (USD 28,800) pays 36 transcription annotators — two per dialect — at USD 200/month (900,000 MGA) over four active processing months.</w:t>
+        <w:t>Annotation and ground truth (USD 3,591) pays 9 transcription annotators at USD 133/month (600,000 MGA) over three active processing months (9 × 133 × 3 = USD 3,591).</w:t>
         <w:br/>
         <w:br/>
-        <w:t>Equipment and software (USD 8,000) covers six laptops and field recording hardware. Travel (USD 16,000) covers eighteen dialect regions. Workshops (USD 4,500) fund field team training, a final dissemination event, and a regional conference. Overhead is capped at 5% (USD 11,671).</w:t>
+        <w:t>Equipment and software (USD 8,000) covers six laptops and field recording hardware. Travel (USD 16,000) covers eighteen dialect regions. Workshops (USD 4,500) fund field team training, a final dissemination event, and a regional conference. Overhead is capped at 5% (USD 11,904).</w:t>
       </w:r>
     </w:p>
     <w:p>

</xml_diff>

<commit_message>
Correct org data from official docs: Fenitra title, impact KPIs, partners
- Fenitra: title corrected to 'Head of Cloud Regulatory Affairs' (full),
  added 'premier Malgache à des fonctions de direction stratégique chez Google',
  removed unsourced 'Juriste spécialisé' qualifier
- Impact KPIs: 5 000 formées → 5 500 bénéficiaires uniques + 2 366 certifiées
  (e-jery 1 483, ANKY 472, Madagascar DataCamp 411); removed '550/month' figure
- Partners: Telma/Sayna/CoderDojo/STEM4Good replaced with documented partners
  (e-jery, ANKY, Madagascar DataCamp, Down Syndrome Madagascar)
- Trisomy 21 programme: added '28 enfants, 3 cohortes, Down Syndrome Madagascar'
- Added Ampela Online (women entrepreneurship, 48% female users) throughout
</commit_message>
<xml_diff>
--- a/LINGUA_Africa_Application_MGVaovao_EN.docx
+++ b/LINGUA_Africa_Application_MGVaovao_EN.docx
@@ -591,7 +591,7 @@
         <w:t>A first working proof of concept covering four dialects has been operational since April 2026, with end-to-end latency under five seconds, on Cloud Run GPU. This prototype demonstrates the technical feasibility of the approach and constitutes a concrete foundation to be improved and extended — not a finalised system or a fully deployed production solution. Since the project launch at end of 2025, the team has already compiled approximately 1,000 data pairs, confirming the operational feasibility of the collection process.</w:t>
         <w:br/>
         <w:br/>
-        <w:t>LINGUA Africa support will allow us to extend coverage to the remaining 14 dialects, build the first open vocal resources for the full Malagasy dialect continuum, and deploy this service within the education, health, and civic inclusion programmes of MGVaovao - Maison du Numérique, a community centre welcoming over 550 people per month that has trained more than 5,000 individuals since its inauguration in February 2024.</w:t>
+        <w:t>LINGUA Africa support will allow us to extend coverage to the remaining 14 dialects, build the first open vocal resources for the full Malagasy dialect continuum, and deploy this service within the education, health, and civic inclusion programmes of MGVaovao - Maison du Numérique, a community centre that has reached over 5,500 unique beneficiaries and accompanied 2,366 certified people since its inauguration in February 2024.</w:t>
       </w:r>
     </w:p>
     <w:p>
@@ -633,10 +633,10 @@
         <w:t>To date, fewer than ten published academic works address the computational processing of Malagasy in its dialectal diversity. Major multilingual datasets — Common Voice, FLORES-200, OPUS — contain data for Official Malagasy, but nothing for its regional varieties. MGVaovao - Maison du Numérique is creating these resources for the first time, with rigour, within a community framework, and under fully open licences.</w:t>
         <w:br/>
         <w:br/>
-        <w:t>The direct beneficiaries are the speakers of under-represented Malagasy dialects, a population estimated at over fifteen million people. Among Maison du Numérique's active programmes is a dedicated digital inclusion initiative for children with Down syndrome (trisomy 21) — a concrete demonstration that the organisation's mission extends to every form of exclusion, including disability.</w:t>
+        <w:t>The direct beneficiaries are the speakers of under-represented Malagasy dialects, a population estimated at over fifteen million people. Among Maison du Numérique's active programmes are a digital inclusion initiative for children with Down syndrome (trisomy 21) — 28 children accompanied across three cohorts in partnership with Down Syndrome Madagascar — and the Ampela Online programme for women's entrepreneurship, concrete demonstrations that the organisation's mission extends to every form of exclusion.</w:t>
         <w:br/>
         <w:br/>
-        <w:t>The team carrying this project is deeply locally rooted and technically capable at an international level. Fenitra Ravelomanantsoa, founder of Madagasikara Vaovao, is Head of Cloud Regulatory (Director of Cloud Legal and Regulatory Affairs) at Google in Zurich, where he oversees regulatory compliance for cloud infrastructure at international scale. Norolala Randrianarison handles day-to-day operational management. Guillaume Rakotonjanahary Tsantaniaina and Karine Maholisoa Rajaofera each lead a complementary strand of the project. Guillaume is Technical Project Lead for ML development, pipeline architecture, and cloud deployment. Holder of a Master's in Big Data and AI from ESTIA France with distinction (17.2/20), he has built across five years a broad range of production AI systems: complete Speech AI pipelines, multi-agent LLM systems with LangGraph and Google ADK, hybrid RAG architectures, computer vision models (YOLO V8, CLIP, SAM), digital health platforms, and MLOps infrastructure on Vertex AI. His participation in IndabaX Madagascar 2023 (3rd place, NLP medical classification at 94% accuracy) and DataTour 2025 (pan-African competition) demonstrates his engagement in the African AI ecosystem. Karine Maholisoa Rajaofera, Data Operations and Functional Project Lead, brings ten years of experience in data operations, annotation, and large-scale collection coordination. This complementarity between world-class ML expertise and hands-on data operations mastery makes this project both technically solid and genuinely grounded in operational community reality.</w:t>
+        <w:t>The team carrying this project is deeply locally rooted and technically capable at an international level. Fenitra Ravelomanantsoa, founder of Madagasikara Vaovao, is Head of Cloud Regulatory Affairs at Google in Zurich — the first Malagasy to reach a senior leadership position in this company. He regularly speaks at major international forums on AI governance and the modernisation of public infrastructure through Cloud. Norolala Randrianarison handles day-to-day operational management. Guillaume Rakotonjanahary Tsantaniaina and Karine Maholisoa Rajaofera each lead a complementary strand of the project. Guillaume is Technical Project Lead for ML development, pipeline architecture, and cloud deployment. Holder of a Master's in Big Data and AI from ESTIA France with distinction (17.2/20), he has built across five years a broad range of production AI systems: complete Speech AI pipelines, multi-agent LLM systems with LangGraph and Google ADK, hybrid RAG architectures, computer vision models (YOLO V8, CLIP, SAM), digital health platforms, and MLOps infrastructure on Vertex AI. His participation in IndabaX Madagascar 2023 (3rd place, NLP medical classification at 94% accuracy) and DataTour 2025 (pan-African competition) demonstrates his engagement in the African AI ecosystem. Karine Maholisoa Rajaofera, Data Operations and Functional Project Lead, brings ten years of experience in data operations, annotation, and large-scale collection coordination. This complementarity between world-class ML expertise and hands-on data operations mastery makes this project both technically solid and genuinely grounded in operational community reality.</w:t>
       </w:r>
     </w:p>
     <w:p>
@@ -705,7 +705,7 @@
         <w:t>This dialectal translation project operates at the intersection of three priority domains defined by LINGUA Africa.</w:t>
         <w:br/>
         <w:br/>
-        <w:t>The first domain is education. Maison du Numérique welcomes over 550 young people and adults each month through its digital literacy programmes — E-JERY (internet and digital discovery) and HOLI DEV (coding and computational thinking) — both supported by Telma Madagascar. Most significantly, Maison du Numérique runs a dedicated digital inclusion programme for children with Down syndrome (trisomy 21), an initiative led by its volunteer team that demonstrates a radically inclusive vision of digital access. Integrating a dialectal translation system allows trainers to address learners in their native linguistic variety, improving comprehension and engagement. Targeted sub-domains include digital literacy, foundational education, and special needs education.</w:t>
+        <w:t>The first domain is education. Maison du Numérique has reached over 5,500 unique beneficiaries through its digital literacy programmes, with 2,366 people trained and certified via e-jery, ANKY, and Madagascar DataCamp. Most significantly, Maison du Numérique runs a digital inclusion programme for children with Down syndrome (trisomy 21) — 28 children accompanied in partnership with Down Syndrome Madagascar — and the Ampela Online programme for women's entrepreneurship, initiatives that demonstrate a radically inclusive vision of digital access. Integrating a dialectal translation system allows trainers to address learners in their native linguistic variety, improving comprehension and engagement. Targeted sub-domains include digital literacy, foundational education, and special needs education.</w:t>
         <w:br/>
         <w:br/>
         <w:t>The second domain is public health. In partnership with community health actors, the system will enable the dissemination of prevention messages covering maternal and child health, vaccination, and epidemic management, in the dialects of the regions concerned.</w:t>
@@ -843,7 +843,7 @@
         <w:t>The expected impact is structured around four axes. In education, the system allows trainers to address learners in their native variety, improving comprehension and reducing dropout from digital literacy programmes. In health, community health partners can disseminate prevention messages in the dialects of the regions concerned, without requiring a human interpreter. In civic inclusion, information on citizens' rights and administrative procedures can be made accessible in dialect. In terms of digital sovereignty, Madagascar will for the first time have an open linguistic infrastructure built by Malagasy people for Malagasy people.</w:t>
         <w:br/>
         <w:br/>
-        <w:t>Maison du Numérique constitutes the ideal pilot environment: over 550 monthly users, 5,000 people trained since inauguration, an established partner network (Telma, Sayna, CoderDojo Antananarivo, STEM4Good Madagascar, ANKY), and a community of over 26 documented active volunteers. This human fabric guarantees that the system will be evaluated by real users, in their real context, with genuine needs.</w:t>
+        <w:t>Maison du Numérique constitutes the ideal pilot environment: over 5,500 unique beneficiaries, 2,366 people trained and certified via e-jery, ANKY, and Madagascar DataCamp, and a community of over 26 documented active volunteers. This human fabric guarantees that the system will be evaluated by real users, in their real context, with genuine needs.</w:t>
       </w:r>
     </w:p>
     <w:p>
@@ -1180,7 +1180,7 @@
         <w:t>On consent and speaker protection, every participant signs an informed consent form available in Official Malagasy and in their local dialect. This form explains the nature of the data collected, its intended use, the CC BY 4.0 licence under which it will be published, and the unconditional right of withdrawal at any point before publication. Minors participate only with written parental or guardian consent.</w:t>
         <w:br/>
         <w:br/>
-        <w:t>On inclusion and representation, the collection protocol explicitly mandates gender parity: at minimum 50 percent of recorded speakers in each dialect must be women. Age diversity is addressed with three age brackets (18–35, 36–55, 55+) to capture intergenerational phonological variation. Local coordinators are themselves members of the targeted communities. Maison du Numérique's commitment to inclusion goes beyond gender and age: the organisation already runs a dedicated digital inclusion programme for children with Down syndrome, led by volunteers — documented daily practice that places it among the most genuinely inclusive organisations in Madagascar's digital ecosystem.</w:t>
+        <w:t>On inclusion and representation, the collection protocol explicitly mandates gender parity: at minimum 50 percent of recorded speakers in each dialect must be women. Age diversity is addressed with three age brackets (18–35, 36–55, 55+) to capture intergenerational phonological variation. Local coordinators are themselves members of the targeted communities. Maison du Numérique's commitment to inclusion goes beyond gender and age: the organisation already runs a dedicated digital inclusion programme for children with Down syndrome — 28 children accompanied in partnership with Down Syndrome Madagascar — and the Ampela Online programme for women's entrepreneurship, documented daily practices that place it among the most genuinely inclusive organisations in Madagascar's digital ecosystem.</w:t>
         <w:br/>
         <w:br/>
         <w:t>On licensing and openness, all project deliverables — audio corpora, transcriptions, fine-tuned model weights, scripts, documentation — are published under fully open licences: Apache 2.0 for models and code, Creative Commons BY 4.0 for data.</w:t>
@@ -1189,7 +1189,7 @@
         <w:t>On environmental impact, the project deliberately minimises its compute footprint through the use of distilled models (NLLB-200-distilled-600M), INT8 quantisation, LoRA fine-tuning, and a scale-to-zero production infrastructure that eliminates energy consumption outside active usage periods.</w:t>
         <w:br/>
         <w:br/>
-        <w:t>On data governance, all collected data is stored on GCS with encryption at rest and access restricted to the project team. Fenitra Ravelomanantsoa, as digital law specialist and Head of Cloud Regulatory at Google, personally ensures the project's compliance with international data protection standards. This level of legal expertise in data governance is rare among African language AI projects and represents a distinctive asset of this application.</w:t>
+        <w:t>On data governance, all collected data is stored on GCS with encryption at rest and access restricted to the project team. Fenitra Ravelomanantsoa, as Head of Cloud Regulatory Affairs at Google, personally ensures the project's compliance with international data protection standards. This level of expertise in data governance is rare among African language AI projects and represents a distinctive asset of this application.</w:t>
       </w:r>
     </w:p>
     <w:p>
@@ -1219,7 +1219,7 @@
           <w:i w:val="0"/>
           <w:sz w:val="22"/>
         </w:rPr>
-        <w:t>No. MGVaovao - Maison du Numérique (Madagasikara Vaovao) submits this proposal as the lead organisation. The project operates with an established network of operational partners — Telma Madagascar, Sayna, CoderDojo Antananarivo, STEM4Good Madagascar, and ANKY — who contribute to community outreach and programme delivery but are not formal co-applicants. Letters of support can be provided on request.</w:t>
+        <w:t>No. MGVaovao - Maison du Numérique (Madagasikara Vaovao) submits this proposal as the lead organisation. The project operates with an established network of operational partners — e-jery, ANKY, Madagascar DataCamp, and Down Syndrome Madagascar — who contribute to community outreach and programme delivery but are not formal co-applicants. Letters of support can be provided on request.</w:t>
       </w:r>
     </w:p>
     <w:p>
@@ -1249,7 +1249,7 @@
           <w:i w:val="0"/>
           <w:sz w:val="22"/>
         </w:rPr>
-        <w:t>Letters of support can be requested from Maison du Numérique's operational partners, notably Telma Madagascar for the E-JERY and HOLI DEV programmes, Sayna, CoderDojo Antananarivo, STEM4Good Madagascar, and ANKY. These partnerships are active and documented since the inauguration of Maison du Numérique in February 2024.</w:t>
+        <w:t>Letters of support can be requested from Maison du Numérique's operational partners, notably e-jery (digital training, 1,483 people certified), ANKY (472), Madagascar DataCamp (411), and Down Syndrome Madagascar (trisomy 21 programme). These partnerships are active and documented since the inauguration of Maison du Numérique in February 2024.</w:t>
         <w:br/>
         <w:br/>
         <w:t>Supplementary documentation is directly accessible in the public GitHub repositories. The repository github.com/mgvaovao/ml contains a detailed README describing the complete pipeline architecture, fine-tuning reproduction instructions, evaluation metrics obtained, and data structure, as well as a file MGVaovao_Architecture_Complete.md documenting all architectural choices, dependencies, and data flow. The repository github.com/mgvaovao/backend_ia likewise contains a complete README and API documentation. All of these resources are published under Apache 2.0 licence.</w:t>
@@ -1298,7 +1298,7 @@
           <w:i w:val="0"/>
           <w:sz w:val="22"/>
         </w:rPr>
-        <w:t>A legal professional specialising in digital law and Head of Cloud Regulatory (Director of Cloud Legal and Regulatory Affairs) at Google in Zurich, Fenitra holds a senior leadership position at one of the world's leading technology companies, where he oversees regulatory compliance for cloud infrastructure at international scale. After over 20 years of international career across Paris, Barcelona, London, and Zurich, he founded the Madagasikara Vaovao association and MGVaovao - Maison du Numérique in November 2023, convinced that his expertise in technology governance, data protection, and cloud compliance could directly benefit his country. He oversees the project's global strategy, institutional partnerships, and ethical governance.</w:t>
+        <w:t>Head of Cloud Regulatory Affairs at Google in Zurich, Fenitra is the first Malagasy to reach a senior leadership position in this company. He regularly speaks at major international forums on AI governance and the modernisation of public infrastructure through Cloud. After over 20 years of international career across Paris, Barcelona, London, and Zurich, he founded the Madagasikara Vaovao association and MGVaovao - Maison du Numérique in November 2023, convinced that his expertise in technology governance, data protection, and cloud compliance could directly benefit his country. He oversees the project's global strategy, institutional partnerships, and ethical governance.</w:t>
       </w:r>
     </w:p>
     <w:p>
@@ -1391,7 +1391,7 @@
           <w:i w:val="0"/>
           <w:sz w:val="22"/>
         </w:rPr>
-        <w:t>Holder of a Bachelor's degree in Business Management, Karine brings ten years of experience in data operations, large-scale collection, and field team coordination. A Data Specialist and Lidar Expert at SmartOne.ai, she has led data collection, annotation, and validation projects in real-world conditions over a decade. She joined MGVaovao - Maison du Numérique in September 2025 and has since led the AI programme on Malagasy dialects as principal project lead. She oversees the full voice collection cycle across fourteen dialectal regions, defines annotation protocols, ensures transcription quality control, coordinates field teams, and translates business requirements into functional specifications for the technical pipeline. Proficient in Word, Excel, Google Sheets, and the full suite of Google platforms, she serves as the interface between field operational realities and the technical strand. She also leads the digital inclusion programme for children with Down syndrome at Maison du Numérique.</w:t>
+        <w:t>Holder of a Bachelor's degree in Business Management, Karine brings ten years of experience in data operations, large-scale collection, and field team coordination. A Data Specialist and Lidar Expert at SmartOne.ai, she has led data collection, annotation, and validation projects in real-world conditions over a decade. She joined MGVaovao - Maison du Numérique in September 2025 and has since led the AI programme on Malagasy dialects as principal project lead. She oversees the full voice collection cycle across fourteen dialectal regions, defines annotation protocols, ensures transcription quality control, coordinates field teams, and translates business requirements into functional specifications for the technical pipeline. Proficient in Word, Excel, Google Sheets, and the full suite of Google platforms, she serves as the interface between field operational realities and the technical strand. She also leads the digital inclusion programme for children with Down syndrome at Maison du Numérique (28 children accompanied in partnership with Down Syndrome Madagascar).</w:t>
       </w:r>
     </w:p>
     <w:p>
@@ -1464,7 +1464,7 @@
         <w:t>Academically, the project builds on the foundational work of the Masakhane community on African low-resource languages; on the NLLB team publications (Costa-jussà et al., 2022) on massively multilingual translation; on Pratap et al. (2023) on MMS for multilingual voice synthesis; and on advances in automatic speech recognition for under-resourced languages.</w:t>
         <w:br/>
         <w:br/>
-        <w:t>Maison du Numérique brings a documented and verifiable community base: 5,000 people trained since the February 2024 inauguration, 550 active monthly users, and operational partnerships with Telma Madagascar, Sayna, CoderDojo Antananarivo, STEM4Good Madagascar, and ANKY.</w:t>
+        <w:t>Maison du Numérique brings a documented and verifiable community base: over 5,500 unique beneficiaries since its February 2024 inauguration, 2,366 people trained and certified via e-jery (1,483), ANKY (472), and Madagascar DataCamp (411), and 28 children with Down syndrome accompanied in partnership with Down Syndrome Madagascar.</w:t>
       </w:r>
     </w:p>
     <w:p>
@@ -2210,7 +2210,7 @@
           <w:color w:val="960000"/>
           <w:sz w:val="20"/>
         </w:rPr>
-        <w:t>NOTE 3 — Letters of Support (Q14): prepare support letters from Telma and/or Sayna. These letters will significantly strengthen the application.</w:t>
+        <w:t>NOTE 3 — Letters of Support (Q14): prepare support letters from e-jery and/or ANKY and Down Syndrome Madagascar. These letters will significantly strengthen the application.</w:t>
       </w:r>
     </w:p>
     <w:p>

</xml_diff>

<commit_message>
Task 3: Integrate CEO Summit, RSE Award, 48% femmes, philanthropic model into application
Key additions across QA.md, FR and EN generators, and regenerated artefacts:
- Q1b/Summary: RSE de l Annee 2026 (CEO Summit Indian Ocean) nomination + 48% femmes, 7-65 ans, 0 ariary
- Q2/Rationale: Fenitra at CEO Summit Indian Ocean (avril 2026), candidat prix CEO de l Annee
- Q4/Domains: Updated to e-jery/ANKY/DataCamp/Down Syndrome (corrects Task 2 omission in QA.md)
- Q12/Ethics: 28 enfants porteurs trisomie 21 + Down Syndrome Madagascar; Fenitra as Head of Cloud Regulatory Affairs
- Q13/Q14: Partners updated to e-jery/ANKY/DataCamp/Down Syndrome (corrects Task 2 omission in QA.md)
- Q15/Team: Fenitra new bio with CEO Summit + CEO de l Annee + modele philanthropique unique + 0 ariary
- Q16/Prior work: Trimmed prototype description; RSE nomination as external validation
</commit_message>
<xml_diff>
--- a/LINGUA_Africa_Application_MGVaovao_EN.docx
+++ b/LINGUA_Africa_Application_MGVaovao_EN.docx
@@ -591,7 +591,7 @@
         <w:t>A first working proof of concept covering four dialects has been operational since April 2026, with end-to-end latency under five seconds, on Cloud Run GPU. This prototype demonstrates the technical feasibility of the approach and constitutes a concrete foundation to be improved and extended — not a finalised system or a fully deployed production solution. Since the project launch at end of 2025, the team has already compiled approximately 1,000 data pairs, confirming the operational feasibility of the collection process.</w:t>
         <w:br/>
         <w:br/>
-        <w:t>LINGUA Africa support will allow us to extend coverage to the remaining 14 dialects, build the first open vocal resources for the full Malagasy dialect continuum, and deploy this service within the education, health, and civic inclusion programmes of MGVaovao - Maison du Numérique, a community centre that has reached over 5,500 unique beneficiaries and accompanied 2,366 certified people since its inauguration in February 2024.</w:t>
+        <w:t>LINGUA Africa support will allow us to extend coverage to the remaining 14 dialects, build the first open vocal resources for the full Malagasy dialect continuum, and deploy this service within the education, health, and civic inclusion programmes of MGVaovao - Maison du Numérique — shortlisted for the RSE de l'Année 2026 Award (CEO Summit Indian Ocean) —, a community centre that has reached over 5,500 unique beneficiaries (48% women, aged 7 to 65, entirely free of charge) and accompanied 2,366 certified people since its inauguration in February 2024.</w:t>
       </w:r>
     </w:p>
     <w:p>
@@ -636,7 +636,7 @@
         <w:t>The direct beneficiaries are the speakers of under-represented Malagasy dialects, a population estimated at over fifteen million people. Among Maison du Numérique's active programmes are a digital inclusion initiative for children with Down syndrome (trisomy 21) — 28 children accompanied across three cohorts in partnership with Down Syndrome Madagascar — and the Ampela Online programme for women's entrepreneurship, concrete demonstrations that the organisation's mission extends to every form of exclusion.</w:t>
         <w:br/>
         <w:br/>
-        <w:t>The team carrying this project is deeply locally rooted and technically capable at an international level. Fenitra Ravelomanantsoa, founder of Madagasikara Vaovao, is Head of Cloud Regulatory Affairs at Google in Zurich — the first Malagasy to reach a senior leadership position in this company. He regularly speaks at major international forums on AI governance and the modernisation of public infrastructure through Cloud. Norolala Randrianarison handles day-to-day operational management. Guillaume Rakotonjanahary Tsantaniaina and Karine Maholisoa Rajaofera each lead a complementary strand of the project. Guillaume is Technical Project Lead for ML development, pipeline architecture, and cloud deployment. Holder of a Master's in Big Data and AI from ESTIA France with distinction (17.2/20), he has built across five years a broad range of production AI systems: complete Speech AI pipelines, multi-agent LLM systems with LangGraph and Google ADK, hybrid RAG architectures, computer vision models (YOLO V8, CLIP, SAM), digital health platforms, and MLOps infrastructure on Vertex AI. His participation in IndabaX Madagascar 2023 (3rd place, NLP medical classification at 94% accuracy) and DataTour 2025 (pan-African competition) demonstrates his engagement in the African AI ecosystem. Karine Maholisoa Rajaofera, Data Operations and Functional Project Lead, brings ten years of experience in data operations, annotation, and large-scale collection coordination. This complementarity between world-class ML expertise and hands-on data operations mastery makes this project both technically solid and genuinely grounded in operational community reality.</w:t>
+        <w:t>The team carrying this project is deeply locally rooted and technically capable at an international level. Fenitra Ravelomanantsoa, founder of Madagasikara Vaovao, is Head of Cloud Regulatory Affairs at Google in Zurich — the first Malagasy to reach a senior leadership position in this company. He regularly speaks at major international forums on AI governance — including the CEO Summit Indian Ocean (April 2026), where he is also a candidate for the CEO of the Year award — and the modernisation of public infrastructure through Cloud. Norolala Randrianarison handles day-to-day operational management. Guillaume Rakotonjanahary Tsantaniaina and Karine Maholisoa Rajaofera each lead a complementary strand of the project. Guillaume is Technical Project Lead for ML development, pipeline architecture, and cloud deployment. Holder of a Master's in Big Data and AI from ESTIA France with distinction (17.2/20), he has built across five years a broad range of production AI systems: complete Speech AI pipelines, multi-agent LLM systems with LangGraph and Google ADK, hybrid RAG architectures, computer vision models (YOLO V8, CLIP, SAM), digital health platforms, and MLOps infrastructure on Vertex AI. His participation in IndabaX Madagascar 2023 (3rd place, NLP medical classification at 94% accuracy) and DataTour 2025 (pan-African competition) demonstrates his engagement in the African AI ecosystem. Karine Maholisoa Rajaofera, Data Operations and Functional Project Lead, brings ten years of experience in data operations, annotation, and large-scale collection coordination. This complementarity between world-class ML expertise and hands-on data operations mastery makes this project both technically solid and genuinely grounded in operational community reality.</w:t>
       </w:r>
     </w:p>
     <w:p>
@@ -1298,7 +1298,7 @@
           <w:i w:val="0"/>
           <w:sz w:val="22"/>
         </w:rPr>
-        <w:t>Head of Cloud Regulatory Affairs at Google in Zurich, Fenitra is the first Malagasy to reach a senior leadership position in this company. He regularly speaks at major international forums on AI governance and the modernisation of public infrastructure through Cloud. After over 20 years of international career across Paris, Barcelona, London, and Zurich, he founded the Madagasikara Vaovao association and MGVaovao - Maison du Numérique in November 2023, convinced that his expertise in technology governance, data protection, and cloud compliance could directly benefit his country. He oversees the project's global strategy, institutional partnerships, and ethical governance.</w:t>
+        <w:t>Head of Cloud Regulatory Affairs at Google in Zurich — the first Malagasy to reach a senior leadership position in this company —, Fenitra oversees cloud regulatory compliance at international scale. A speaker at the CEO Summit Indian Ocean (April 2026) and candidate for the CEO of the Year award, he founded the Madagasikara Vaovao association and MGVaovao - Maison du Numérique in November 2023 on a unique philanthropic model: funded exclusively from the founder's personal resources, Maison du Numérique provides fully free access (0 ariary) to digital training for Malagasy communities. He oversees the project's global strategy, institutional partnerships, and ethical governance.</w:t>
       </w:r>
     </w:p>
     <w:p>
@@ -1458,13 +1458,13 @@
         <w:t>MGVaovao - Maison du Numérique, founded in November 2023, has been operating since its inauguration in February 2024. It is on this solid institutional base that the speech-to-speech translation project in Malagasy dialects was launched at end of 2025, following a preliminary phase of evaluation of existing ASR and TTS architectures for low-resource languages — including Whisper, Chirp (Vertex AI Studio), and VITS architectures — which established the transfer adaptation methodology now at the core of the pipeline.</w:t>
         <w:br/>
         <w:br/>
-        <w:t>This speech-to-speech translation prototype has been operational since April 2026 for four dialects — Official Malagasy, Betsileo, Betsimisaraka, and Sakalava — with end-to-end latency under five seconds. It constitutes a first concrete result to be improved and extended, not a finalised system. Approximately 1,000 data pairs have already been compiled, demonstrating the team's operational capacity to collect and process real dialectal data.</w:t>
+        <w:t>This prototype has been operational since April 2026 for four dialects (Official Malagasy, Betsileo, Betsimisaraka, Sakalava), with end-to-end latency under five seconds; it is a first result to be extended, not a finalised system. Approximately 1,000 data pairs have already been compiled, including text-text pairs for neural translation and text-audio pairs for speech synthesis.</w:t>
         <w:br/>
         <w:br/>
         <w:t>Academically, the project builds on the foundational work of the Masakhane community on African low-resource languages; on the NLLB team publications (Costa-jussà et al., 2022) on massively multilingual translation; on Pratap et al. (2023) on MMS for multilingual voice synthesis; and on advances in automatic speech recognition for under-resourced languages.</w:t>
         <w:br/>
         <w:br/>
-        <w:t>Maison du Numérique brings a documented and verifiable community base: over 5,500 unique beneficiaries since its February 2024 inauguration, 2,366 people trained and certified via e-jery (1,483), ANKY (472), and Madagascar DataCamp (411), and 28 children with Down syndrome accompanied in partnership with Down Syndrome Madagascar.</w:t>
+        <w:t>Maison du Numérique brings a documented and verifiable community base: over 5,500 unique beneficiaries since its February 2024 inauguration, 2,366 people trained and certified via e-jery (1,483), ANKY (472), and Madagascar DataCamp (411), and 28 children with Down syndrome accompanied in partnership with Down Syndrome Madagascar. Shortlisted for the RSE de l'Année 2026 Award (CEO Summit Indian Ocean), MGVaovao benefits from external recognition of its social impact.</w:t>
       </w:r>
     </w:p>
     <w:p>

</xml_diff>

<commit_message>
Update all GitHub references to mgvaovao-Mdn organisation
Remote changed from mgvaovao/ml to mgvaovao-Mdn/ml.
All in-document URLs (README, generators, QA.md) updated accordingly:
github.com/mgvaovao/ -> github.com/mgvaovao-Mdn/
Both DOCX artefacts regenerated to reflect new repo URL in web presence field.
</commit_message>
<xml_diff>
--- a/LINGUA_Africa_Application_MGVaovao_EN.docx
+++ b/LINGUA_Africa_Application_MGVaovao_EN.docx
@@ -289,7 +289,7 @@
           <w:i w:val="0"/>
           <w:sz w:val="22"/>
         </w:rPr>
-        <w:t>https://mgvaovao.com  |  https://github.com/mgvaovao/ml  |  https://github.com/mgvaovao/backend_ia  |  https://www.linkedin.com/company/maison-du-num%C3%A9rique-madagascar  |  https://www.facebook.com/profile.php?id=61552728359577</w:t>
+        <w:t>https://mgvaovao.com  |  https://github.com/mgvaovao-Mdn/ml  |  https://github.com/mgvaovao-Mdn/backend_ia  |  https://www.linkedin.com/company/maison-du-num%C3%A9rique-madagascar  |  https://www.facebook.com/profile.php?id=61552728359577</w:t>
       </w:r>
     </w:p>
     <w:p>
@@ -801,7 +801,7 @@
         <w:t>The fourth component is the dialectal Text-to-Speech synthesis module, based on Meta's MMS-TTS-MLG VITS model, fine-tuned per dialect from 80 to 150 high-quality audio samples in 1 to 2 hours on an L4 Spot GPU via the ylacombe/finetune-hf-vits framework. Each dialect checkpoint is versioned in Vertex AI Model Registry with associated evaluation metadata. All checkpoints are published under Apache 2.0.</w:t>
         <w:br/>
         <w:br/>
-        <w:t>The full pipeline is exposed through a FastAPI application deployed on Google Cloud Run GPU (NVIDIA L4 24 GB), with end-to-end latency under five seconds and a total VRAM footprint of 6.2 GB supporting three to five concurrent sessions per instance. The complete source code, fine-tuning scripts, and technical documentation are published on GitHub at github.com/mgvaovao/ml and github.com/mgvaovao/backend_ia, under Apache 2.0.</w:t>
+        <w:t>The full pipeline is exposed through a FastAPI application deployed on Google Cloud Run GPU (NVIDIA L4 24 GB), with end-to-end latency under five seconds and a total VRAM footprint of 6.2 GB supporting three to five concurrent sessions per instance. The complete source code, fine-tuning scripts, and technical documentation are published on GitHub at github.com/mgvaovao-Mdn/ml and github.com/mgvaovao-Mdn/backend_ia, under Apache 2.0.</w:t>
         <w:br/>
         <w:br/>
         <w:t>These components reflect the most performant models available at the time of prototype development. The architecture is modular: should more powerful or better-suited models for very low-resource languages emerge during the project, their integration into the pipeline would be considered and evaluated against the same quality criteria.</w:t>
@@ -1057,7 +1057,7 @@
         <w:t>The model pipeline, however performant, produces impact only if it is accessible to non-technical users. The application layer is the direct point of contact with beneficiaries.</w:t>
         <w:br/>
         <w:br/>
-        <w:t>The FastAPI application deployed on Cloud Run GPU exposes the models through documented REST endpoints, enabling any institutional partner to integrate the dialectal translation service into their own tools. The API handles authentication, target dialect selection, audio input validation, and structured error responses. The full source code is published at github.com/mgvaovao/backend_ia under Apache 2.0.</w:t>
+        <w:t>The FastAPI application deployed on Cloud Run GPU exposes the models through documented REST endpoints, enabling any institutional partner to integrate the dialectal translation service into their own tools. The API handles authentication, target dialect selection, audio input validation, and structured error responses. The full source code is published at github.com/mgvaovao-Mdn/backend_ia under Apache 2.0.</w:t>
         <w:br/>
         <w:br/>
         <w:t>On top of this API, a real-time interface — WebRTC for browser-based access or WebSocket for partner integrations — enables interactive translation sessions with under five seconds of end-to-end latency. Automatic end-of-speech detection relies on Silero VAD, already integrated at the core of the pipeline, which segments the incoming audio stream in 32 ms windows and triggers each translation cycle as soon as a sentence ends, without requiring any user action. The user selects their target dialect and speaks in one of the six supported source languages. The system transcribes, translates, and synthesises the response in a single unified request.</w:t>
@@ -1099,7 +1099,7 @@
         <w:t>In terms of linguistic resources, the project will produce and publish eighteen dialectal audio corpora covering the full range of Malagasy regional varieties — an estimated total of 2,500 to 3,000 hours of transcribed and validated speech. These corpora will be published on HuggingFace and contributed to Mozilla Common Voice under Creative Commons BY 4.0. They will constitute the first open speech resources for Malagasy dialects, immediately reusable by the African and global NLP research community.</w:t>
         <w:br/>
         <w:br/>
-        <w:t>In terms of models and tools, the project will publish on github.com/mgvaovao/ml and HuggingFace: LoRA fine-tuned NLLB-200 weights for eighteen Malagasy dialects (Apache 2.0); MMS-TTS-MLG VITS checkpoints for eighteen dialects (Apache 2.0); fully documented, reproducible fine-tuning scripts; a Malagasy dialectal evaluation benchmark with hold-out test sets and reference metrics; and a public, documented API at github.com/mgvaovao/backend_ia enabling third-party integration of the pipeline.</w:t>
+        <w:t>In terms of models and tools, the project will publish on github.com/mgvaovao-Mdn/ml and HuggingFace: LoRA fine-tuned NLLB-200 weights for eighteen Malagasy dialects (Apache 2.0); MMS-TTS-MLG VITS checkpoints for eighteen dialects (Apache 2.0); fully documented, reproducible fine-tuning scripts; a Malagasy dialectal evaluation benchmark with hold-out test sets and reference metrics; and a public, documented API at github.com/mgvaovao-Mdn/backend_ia enabling third-party integration of the pipeline.</w:t>
         <w:br/>
         <w:br/>
         <w:t>In terms of community impact, the project will document: the number of system usage sessions at Maison du Numérique (target: 2,000 sessions over twelve months); the number of native speakers who participated in data collection (target: 500 people across fourteen regions); and the results of satisfaction and intelligibility evaluations conducted with end users.</w:t>
@@ -1252,7 +1252,7 @@
         <w:t>Letters of support can be requested from Maison du Numérique's operational partners, notably e-jery (digital training, 1,483 people certified), ANKY (472), Madagascar DataCamp (411), and Down Syndrome Madagascar (trisomy 21 programme). These partnerships are active and documented since the inauguration of Maison du Numérique in February 2024.</w:t>
         <w:br/>
         <w:br/>
-        <w:t>Supplementary documentation is directly accessible in the public GitHub repositories. The repository github.com/mgvaovao/ml contains a detailed README describing the complete pipeline architecture, fine-tuning reproduction instructions, evaluation metrics obtained, and data structure, as well as a file MGVaovao_Architecture_Complete.md documenting all architectural choices, dependencies, and data flow. The repository github.com/mgvaovao/backend_ia likewise contains a complete README and API documentation. All of these resources are published under Apache 2.0 licence.</w:t>
+        <w:t>Supplementary documentation is directly accessible in the public GitHub repositories. The repository github.com/mgvaovao-Mdn/ml contains a detailed README describing the complete pipeline architecture, fine-tuning reproduction instructions, evaluation metrics obtained, and data structure, as well as a file MGVaovao_Architecture_Complete.md documenting all architectural choices, dependencies, and data flow. The repository github.com/mgvaovao-Mdn/backend_ia likewise contains a complete README and API documentation. All of these resources are published under Apache 2.0 licence.</w:t>
       </w:r>
     </w:p>
     <w:p>
@@ -2178,7 +2178,7 @@
           <w:color w:val="960000"/>
           <w:sz w:val="20"/>
         </w:rPr>
-        <w:t>NOTE 1 — GitHub public repositories: before submission, make github.com/mgvaovao/ml public and add a LICENSE file (Apache 2.0). Verify that MGVaovao_Architecture_Complete.md is present in the repository.</w:t>
+        <w:t>NOTE 1 — GitHub public repositories: before submission, make github.com/mgvaovao-Mdn/ml public and add a LICENSE file (Apache 2.0). Verify that MGVaovao_Architecture_Complete.md is present in the repository.</w:t>
       </w:r>
     </w:p>
     <w:p>

</xml_diff>

<commit_message>
Refactor budget: 12 postes, salaires ajustés, tour Madagascar, synchro Excel/DOCX
- Réduit salaires directrice et chefs de projet à 1 333 USD/mois (6 000 000 MGA)
- Supprime développeur full-stack, ajoute développeur mobile (12 postes au total)
- Supprime doublon développeur IA/ML engineer (un seul poste)
- Fusionne sections collecte et annotation → "Collecte et traitement des données" (14 231 USD)
- Augmente déplacements à 20 000 USD (transport local coordinateurs)
- Augmente formation/ateliers à 22 000 USD (tournée nationale 18 villes)
- Porte communication à 2 500 USD (stratégie réseaux sociaux)
- Nouveau total : 220 167 directs + 5 % frais généraux = 231 175 USD
- Synchronise Excel (generate_budget.py), DOCX FR et EN, LINGUA_Africa_Application_QA.md
- Supprime noms personnels dans Excel, titres de postes uniquement
- Ajoute référence docs privées dans .gitignore
</commit_message>
<xml_diff>
--- a/LINGUA_Africa_Application_MGVaovao_EN.docx
+++ b/LINGUA_Africa_Application_MGVaovao_EN.docx
@@ -1558,7 +1558,7 @@
                 <w:rFonts w:ascii="Calibri" w:hAnsi="Calibri"/>
                 <w:sz w:val="20"/>
               </w:rPr>
-              <w:t>1. Personnel — leadership + technical team (13 positions)</w:t>
+              <w:t>1. Personnel — leadership + technical team (12 positions)</w:t>
             </w:r>
           </w:p>
         </w:tc>
@@ -1572,7 +1572,7 @@
                 <w:rFonts w:ascii="Calibri" w:hAnsi="Calibri"/>
                 <w:sz w:val="20"/>
               </w:rPr>
-              <w:t>192,852</w:t>
+              <w:t>152,436</w:t>
             </w:r>
           </w:p>
         </w:tc>
@@ -1618,7 +1618,7 @@
                 <w:rFonts w:ascii="Calibri" w:hAnsi="Calibri"/>
                 <w:sz w:val="20"/>
               </w:rPr>
-              <w:t>3. Field collection — 20 collectors × USD 133 × 4 months</w:t>
+              <w:t>3. Data collection and processing</w:t>
             </w:r>
           </w:p>
         </w:tc>
@@ -1632,7 +1632,7 @@
                 <w:rFonts w:ascii="Calibri" w:hAnsi="Calibri"/>
                 <w:sz w:val="20"/>
               </w:rPr>
-              <w:t>10,640</w:t>
+              <w:t>14,231</w:t>
             </w:r>
           </w:p>
         </w:tc>
@@ -1648,7 +1648,7 @@
                 <w:rFonts w:ascii="Calibri" w:hAnsi="Calibri"/>
                 <w:sz w:val="20"/>
               </w:rPr>
-              <w:t>4. Annotation &amp; ground truth — 9 annotators × USD 133 × 3 months</w:t>
+              <w:t>4. Travel and field activities</w:t>
             </w:r>
           </w:p>
         </w:tc>
@@ -1662,7 +1662,7 @@
                 <w:rFonts w:ascii="Calibri" w:hAnsi="Calibri"/>
                 <w:sz w:val="20"/>
               </w:rPr>
-              <w:t>3,591</w:t>
+              <w:t>20,000</w:t>
             </w:r>
           </w:p>
         </w:tc>
@@ -1678,7 +1678,7 @@
                 <w:rFonts w:ascii="Calibri" w:hAnsi="Calibri"/>
                 <w:sz w:val="20"/>
               </w:rPr>
-              <w:t>5. Travel and field activities</w:t>
+              <w:t>5. Training and workshops</w:t>
             </w:r>
           </w:p>
         </w:tc>
@@ -1692,7 +1692,7 @@
                 <w:rFonts w:ascii="Calibri" w:hAnsi="Calibri"/>
                 <w:sz w:val="20"/>
               </w:rPr>
-              <w:t>16,000</w:t>
+              <w:t>22,000</w:t>
             </w:r>
           </w:p>
         </w:tc>
@@ -1708,7 +1708,7 @@
                 <w:rFonts w:ascii="Calibri" w:hAnsi="Calibri"/>
                 <w:sz w:val="20"/>
               </w:rPr>
-              <w:t>6. Workshops, meetings and training</w:t>
+              <w:t>6. Communications and outreach</w:t>
             </w:r>
           </w:p>
         </w:tc>
@@ -1722,7 +1722,7 @@
                 <w:rFonts w:ascii="Calibri" w:hAnsi="Calibri"/>
                 <w:sz w:val="20"/>
               </w:rPr>
-              <w:t>4,500</w:t>
+              <w:t>2,500</w:t>
             </w:r>
           </w:p>
         </w:tc>
@@ -1738,37 +1738,7 @@
                 <w:rFonts w:ascii="Calibri" w:hAnsi="Calibri"/>
                 <w:sz w:val="20"/>
               </w:rPr>
-              <w:t>7. Communications and outreach</w:t>
-            </w:r>
-          </w:p>
-        </w:tc>
-        <w:tc>
-          <w:tcPr>
-            <w:tcW w:type="dxa" w:w="4533"/>
-          </w:tcPr>
-          <w:p>
-            <w:r>
-              <w:rPr>
-                <w:rFonts w:ascii="Calibri" w:hAnsi="Calibri"/>
-                <w:sz w:val="20"/>
-              </w:rPr>
-              <w:t>1,500</w:t>
-            </w:r>
-          </w:p>
-        </w:tc>
-      </w:tr>
-      <w:tr>
-        <w:tc>
-          <w:tcPr>
-            <w:tcW w:type="dxa" w:w="4533"/>
-          </w:tcPr>
-          <w:p>
-            <w:r>
-              <w:rPr>
-                <w:rFonts w:ascii="Calibri" w:hAnsi="Calibri"/>
-                <w:sz w:val="20"/>
-              </w:rPr>
-              <w:t>8. Other direct costs</w:t>
+              <w:t>7. Other direct costs</w:t>
             </w:r>
           </w:p>
         </w:tc>
@@ -1814,7 +1784,7 @@
                 <w:b/>
                 <w:sz w:val="20"/>
               </w:rPr>
-              <w:t>238,083</w:t>
+              <w:t>220,167</w:t>
             </w:r>
           </w:p>
         </w:tc>
@@ -1830,7 +1800,7 @@
                 <w:rFonts w:ascii="Calibri" w:hAnsi="Calibri"/>
                 <w:sz w:val="20"/>
               </w:rPr>
-              <w:t>9. Overhead / Indirect Costs (5%)</w:t>
+              <w:t>Overhead / Indirect Costs (5%)</w:t>
             </w:r>
           </w:p>
         </w:tc>
@@ -1844,7 +1814,7 @@
                 <w:rFonts w:ascii="Calibri" w:hAnsi="Calibri"/>
                 <w:sz w:val="20"/>
               </w:rPr>
-              <w:t>11,904</w:t>
+              <w:t>11,008</w:t>
             </w:r>
           </w:p>
         </w:tc>
@@ -1876,7 +1846,7 @@
                 <w:b/>
                 <w:sz w:val="20"/>
               </w:rPr>
-              <w:t>249,987</w:t>
+              <w:t>231,175</w:t>
             </w:r>
           </w:p>
         </w:tc>
@@ -1910,19 +1880,16 @@
           <w:i w:val="0"/>
           <w:sz w:val="22"/>
         </w:rPr>
-        <w:t>The proposed budget of USD 249,987 faithfully reflects the planned activities and the real cost structure of the Malagasy context, remaining below the USD 250,000 ceiling for Category 3.</w:t>
+        <w:t>The proposed budget of USD 231,175 faithfully reflects the planned activities and the real cost structure of the Malagasy context, remaining well below the USD 250,000 ceiling for Category 3.</w:t>
         <w:br/>
         <w:br/>
-        <w:t>Personnel (USD 192,852) covers 13 positions over eighteen months: the five permanent leadership team members (founder at 50%, local director, Technical ML Project Lead, Data Operations Project Lead, and partnerships project lead starting month 7), plus eight developers — backend, frontend, AI, data science, DevOps — paid at 1,500,000 MGA per month (USD 333 each), fully included in the LINGUA Africa budget.</w:t>
+        <w:t>Personnel (USD 152,436) covers 12 positions over eighteen months. The leadership team comprises a founder at 50% time, a local director, a Technical ML Project Lead, a Data and Operations Project Lead and a Partnerships Project Lead joining at month 7, each compensated at USD 1,333 per month (MGA 6,000,000). The technical team consists of seven specialized developers — backend, frontend, mobile, AI/ML, data scientist, DevOps and data engineer — paid at USD 333 per month (MGA 1,500,000) each.</w:t>
         <w:br/>
         <w:br/>
-        <w:t>Field collection (USD 10,640) pays 20 field collectors at USD 133/month (600,000 MGA) over four active collection months (20 × 133 × 4 = USD 10,640).</w:t>
+        <w:t>Data collection and processing (USD 14,231) covers twenty field collectors active for four months at USD 133/month as well as nine transcription annotators active for three months at the same rate.</w:t>
         <w:br/>
         <w:br/>
-        <w:t>Annotation and ground truth (USD 3,591) pays 9 transcription annotators at USD 133/month (600,000 MGA) over three active processing months (9 × 133 × 3 = USD 3,591).</w:t>
-        <w:br/>
-        <w:br/>
-        <w:t>Equipment and software (USD 8,000) covers six laptops and field recording hardware. Travel (USD 16,000) covers eighteen dialect regions. Workshops (USD 4,500) fund field team training, a final dissemination event, and a regional conference. Overhead is capped at 5% (USD 11,904).</w:t>
+        <w:t>Travel (USD 20,000) covers regional missions across fourteen regions, per diem for field supervisors and local transport for collection coordinators within their communities. Training and workshops (USD 22,000) fund a national tour of eighteen cities (transport, accommodation, conference room rental and training materials), an initial coordinators training session, a final dissemination event and participation in a regional NLP conference. Communications (USD 2,500) cover semi-annual reports, digital tools and a social media outreach strategy. Overhead is capped at 5% (USD 11,008), well within the 12% maximum.</w:t>
       </w:r>
     </w:p>
     <w:p>

</xml_diff>

<commit_message>
Fix Fenitra bio accuracy: 'l'un des premiers' + add Yas partnership for Ampela Online
- Corrige 'premier Malgache' → 'l'un des premiers Malgaches' (conforme au texte du PDF officiel)
- Ajoute 'en partenariat avec Yas' pour le programme Ampela Online (Q2 et Q4)
- Appliqué dans LINGUA_Africa_Application_QA.md, generate_application.py, generate_application_en.py
- Régénère les deux DOCX
</commit_message>
<xml_diff>
--- a/LINGUA_Africa_Application_MGVaovao_EN.docx
+++ b/LINGUA_Africa_Application_MGVaovao_EN.docx
@@ -633,10 +633,10 @@
         <w:t>To date, fewer than ten published academic works address the computational processing of Malagasy in its dialectal diversity. Major multilingual datasets — Common Voice, FLORES-200, OPUS — contain data for Official Malagasy, but nothing for its regional varieties. MGVaovao - Maison du Numérique is creating these resources for the first time, with rigour, within a community framework, and under fully open licences.</w:t>
         <w:br/>
         <w:br/>
-        <w:t>The direct beneficiaries are the speakers of under-represented Malagasy dialects, a population estimated at over fifteen million people. Among Maison du Numérique's active programmes are a digital inclusion initiative for children with Down syndrome (trisomy 21) — 28 children accompanied across three cohorts in partnership with Down Syndrome Madagascar — and the Ampela Online programme for women's entrepreneurship, concrete demonstrations that the organisation's mission extends to every form of exclusion.</w:t>
+        <w:t>The direct beneficiaries are the speakers of under-represented Malagasy dialects, a population estimated at over fifteen million people. Among Maison du Numérique's active programmes are a digital inclusion initiative for children with Down syndrome (trisomy 21) — 28 children accompanied across three cohorts in partnership with Down Syndrome Madagascar — and the Ampela Online programme, developed in partnership with Yas, for women's entrepreneurship, concrete demonstrations that the organisation's mission extends to every form of exclusion.</w:t>
         <w:br/>
         <w:br/>
-        <w:t>The team carrying this project is deeply locally rooted and technically capable at an international level. Fenitra Ravelomanantsoa, founder of Madagasikara Vaovao, is Head of Cloud Regulatory Affairs at Google in Zurich — the first Malagasy to reach a senior leadership position in this company. He regularly speaks at major international forums on AI governance — including the CEO Summit Indian Ocean (April 2026), where he is also a candidate for the CEO of the Year award — and the modernisation of public infrastructure through Cloud. Norolala Randrianarison handles day-to-day operational management. Guillaume Rakotonjanahary Tsantaniaina and Karine Maholisoa Rajaofera each lead a complementary strand of the project. Guillaume is Technical Project Lead for ML development, pipeline architecture, and cloud deployment. Holder of a Master's in Big Data and AI from ESTIA France with distinction (17.2/20), he has built across five years a broad range of production AI systems: complete Speech AI pipelines, multi-agent LLM systems with LangGraph and Google ADK, hybrid RAG architectures, computer vision models (YOLO V8, CLIP, SAM), digital health platforms, and MLOps infrastructure on Vertex AI. His participation in IndabaX Madagascar 2023 (3rd place, NLP medical classification at 94% accuracy) and DataTour 2025 (pan-African competition) demonstrates his engagement in the African AI ecosystem. Karine Maholisoa Rajaofera, Data Operations and Functional Project Lead, brings ten years of experience in data operations, annotation, and large-scale collection coordination. This complementarity between world-class ML expertise and hands-on data operations mastery makes this project both technically solid and genuinely grounded in operational community reality.</w:t>
+        <w:t>The team carrying this project is deeply locally rooted and technically capable at an international level. Fenitra Ravelomanantsoa, founder of Madagasikara Vaovao, is Head of Cloud Regulatory Affairs at Google in Zurich — one of the first Malagasy professionals to reach a senior leadership position at Google. He regularly speaks at major international forums on AI governance — including the CEO Summit Indian Ocean (April 2026), where he is also a candidate for the CEO of the Year award — and the modernisation of public infrastructure through Cloud. Norolala Randrianarison handles day-to-day operational management. Guillaume Rakotonjanahary Tsantaniaina and Karine Maholisoa Rajaofera each lead a complementary strand of the project. Guillaume is Technical Project Lead for ML development, pipeline architecture, and cloud deployment. Holder of a Master's in Big Data and AI from ESTIA France with distinction (17.2/20), he has built across five years a broad range of production AI systems: complete Speech AI pipelines, multi-agent LLM systems with LangGraph and Google ADK, hybrid RAG architectures, computer vision models (YOLO V8, CLIP, SAM), digital health platforms, and MLOps infrastructure on Vertex AI. His participation in IndabaX Madagascar 2023 (3rd place, NLP medical classification at 94% accuracy) and DataTour 2025 (pan-African competition) demonstrates his engagement in the African AI ecosystem. Karine Maholisoa Rajaofera, Data Operations and Functional Project Lead, brings ten years of experience in data operations, annotation, and large-scale collection coordination. This complementarity between world-class ML expertise and hands-on data operations mastery makes this project both technically solid and genuinely grounded in operational community reality.</w:t>
       </w:r>
     </w:p>
     <w:p>
@@ -1180,7 +1180,7 @@
         <w:t>On consent and speaker protection, every participant signs an informed consent form available in Official Malagasy and in their local dialect. This form explains the nature of the data collected, its intended use, the CC BY 4.0 licence under which it will be published, and the unconditional right of withdrawal at any point before publication. Minors participate only with written parental or guardian consent.</w:t>
         <w:br/>
         <w:br/>
-        <w:t>On inclusion and representation, the collection protocol explicitly mandates gender parity: at minimum 50 percent of recorded speakers in each dialect must be women. Age diversity is addressed with three age brackets (18–35, 36–55, 55+) to capture intergenerational phonological variation. Local coordinators are themselves members of the targeted communities. Maison du Numérique's commitment to inclusion goes beyond gender and age: the organisation already runs a dedicated digital inclusion programme for children with Down syndrome — 28 children accompanied in partnership with Down Syndrome Madagascar — and the Ampela Online programme for women's entrepreneurship, documented daily practices that place it among the most genuinely inclusive organisations in Madagascar's digital ecosystem.</w:t>
+        <w:t>On inclusion and representation, the collection protocol explicitly mandates gender parity: at minimum 50 percent of recorded speakers in each dialect must be women. Age diversity is addressed with three age brackets (18–35, 36–55, 55+) to capture intergenerational phonological variation. Local coordinators are themselves members of the targeted communities. Maison du Numérique's commitment to inclusion goes beyond gender and age: the organisation already runs a dedicated digital inclusion programme for children with Down syndrome — 28 children accompanied in partnership with Down Syndrome Madagascar — and the Ampela Online programme, developed in partnership with Yas, for women's entrepreneurship, documented daily practices that place it among the most genuinely inclusive organisations in Madagascar's digital ecosystem.</w:t>
         <w:br/>
         <w:br/>
         <w:t>On licensing and openness, all project deliverables — audio corpora, transcriptions, fine-tuned model weights, scripts, documentation — are published under fully open licences: Apache 2.0 for models and code, Creative Commons BY 4.0 for data.</w:t>
@@ -1298,7 +1298,7 @@
           <w:i w:val="0"/>
           <w:sz w:val="22"/>
         </w:rPr>
-        <w:t>Head of Cloud Regulatory Affairs at Google in Zurich — the first Malagasy to reach a senior leadership position in this company —, Fenitra oversees cloud regulatory compliance at international scale. A speaker at the CEO Summit Indian Ocean (April 2026) and candidate for the CEO of the Year award, he founded the Madagasikara Vaovao association and MGVaovao - Maison du Numérique in November 2023 on a unique philanthropic model: funded exclusively from the founder's personal resources, Maison du Numérique provides fully free access (0 ariary) to digital training for Malagasy communities. He oversees the project's global strategy, institutional partnerships, and ethical governance.</w:t>
+        <w:t>Head of Cloud Regulatory Affairs at Google in Zurich — one of the first Malagasy professionals to reach a senior leadership position at Google —, Fenitra oversees cloud regulatory compliance at international scale. A speaker at the CEO Summit Indian Ocean (April 2026) and candidate for the CEO of the Year award, he founded the Madagasikara Vaovao association and MGVaovao - Maison du Numérique in November 2023 on a unique philanthropic model: funded exclusively from the founder's personal resources, Maison du Numérique provides fully free access (0 ariary) to digital training for Malagasy communities. He oversees the project's global strategy, institutional partnerships, and ethical governance.</w:t>
       </w:r>
     </w:p>
     <w:p>

</xml_diff>